<commit_message>
docs(informe): corrige ortografia y agrega nombres reales del equipo
</commit_message>
<xml_diff>
--- a/docs/Informe_Tecnico_Ejecutivo.docx
+++ b/docs/Informe_Tecnico_Ejecutivo.docx
@@ -55,7 +55,7 @@
         <w:jc w:val="center"/>
       </w:pPr>
       <w:r>
-        <w:t xml:space="preserve">Informe Tecnico Ejecutivo</w:t>
+        <w:t xml:space="preserve">Informe Técnico Ejecutivo</w:t>
       </w:r>
     </w:p>
     <w:p>
@@ -82,7 +82,7 @@
           <w:sz w:val="20"/>
           <w:szCs w:val="20"/>
         </w:rPr>
-        <w:t xml:space="preserve">Evaluacion Final Transversal - SCY1101 Programacion para la Ciencia de Datos</w:t>
+        <w:t xml:space="preserve">Evaluación Final Transversal - SCY1101 Programación para la Ciencia de Datos</w:t>
       </w:r>
     </w:p>
     <w:p>
@@ -95,7 +95,7 @@
           <w:sz w:val="20"/>
           <w:szCs w:val="20"/>
         </w:rPr>
-        <w:t xml:space="preserve">Equipo: apotheosisss, manueladmn, ElChacra</w:t>
+        <w:t xml:space="preserve">Equipo: Manuel Díaz, Claudio Aro, Guillermo Cerda</w:t>
       </w:r>
     </w:p>
     <w:p>
@@ -161,7 +161,7 @@
         <w:spacing w:after="120"/>
       </w:pPr>
       <w:r>
-        <w:t xml:space="preserve">DiabetesNHANES es una solucion de ciencia de datos de extremo a extremo que estima el riesgo de diabetes en poblacion adulta a partir de datos publicos de la encuesta NHANES 2021-2023 (CDC/NCHS). El sistema integra multiples fuentes, ejecuta un pipeline ETL reproducible con Kedro, entrena un portafolio de seis modelos de machine learning y expone los resultados mediante una API REST y un dashboard interactivo, todo containerizado con Docker y desplegable en la nube (AWS).</w:t>
+        <w:t xml:space="preserve">DiabetesNHANES es una solución de ciencia de datos de extremo a extremo que estima el riesgo de diabetes en población adulta a partir de datos públicos de la encuesta NHANES 2021-2023 (CDC/NCHS). El sistema integra múltiples fuentes, ejecuta un pipeline ETL reproducible con Kedro, entrena un portafolio de seis modelos de machine learning y expone los resultados mediante una API REST y un dashboard interactivo, todo contenerizado con Docker y desplegable en la nube (AWS).</w:t>
       </w:r>
     </w:p>
     <w:p>
@@ -173,7 +173,7 @@
           <w:i w:val="false"/>
           <w:iCs w:val="false"/>
         </w:rPr>
-        <w:t xml:space="preserve">Sobre 8.149 participantes adultos, el modelo seleccionado (regresion logistica calibrada) alcanza un ROC-AUC de 0,81 y un PR-AUC de 0,44, con una prevalencia real de diabetes del 16 %. El valor de negocio es un instrumento de tamizaje temprano y educativo que prioriza el recall (detectar casos) sobre la exactitud global, adecuado a un problema de salud publica con clases desbalanceadas.</w:t>
+        <w:t xml:space="preserve">Sobre 8.149 participantes adultos, el modelo seleccionado (regresión logística calibrada) alcanza un ROC-AUC de 0,81 y un PR-AUC de 0,44, con una prevalencia real de diabetes del 16 %. El valor de negocio es un instrumento de tamizaje temprano y educativo que prioriza el recall (detectar casos) sobre la exactitud global, adecuado a un problema de salud pública con clases desbalanceadas.</w:t>
       </w:r>
     </w:p>
     <w:p>
@@ -186,7 +186,7 @@
           <w:iCs/>
           <w:color w:val="4A5568"/>
         </w:rPr>
-        <w:t xml:space="preserve">Aviso: la variable objetivo es una aproximacion analitica/educativa basada en criterios ADA; no constituye diagnostico clinico.</w:t>
+        <w:t xml:space="preserve">Aviso: la variable objetivo es una aproximación analítica/educativa basada en criterios ADA; no constituye diagnóstico clínico.</w:t>
       </w:r>
     </w:p>
     <w:p>
@@ -256,7 +256,7 @@
           <w:b w:val="false"/>
           <w:bCs w:val="false"/>
         </w:rPr>
-        <w:t xml:space="preserve"> estimar el riesgo/estado de diabetes usando variables demograficas, antropometricas, de estilo de vida y biomarcadores disponibles en NHANES.</w:t>
+        <w:t xml:space="preserve"> estimar el riesgo/estado de diabetes usando variables demográficas, antropométricas, de estilo de vida y biomarcadores disponibles en NHANES.</w:t>
       </w:r>
     </w:p>
     <w:p>
@@ -287,7 +287,7 @@
           <w:b w:val="false"/>
           <w:bCs w:val="false"/>
         </w:rPr>
-        <w:t xml:space="preserve"> priorizar poblacion para chequeos, dimensionar el problema por segmentos y ofrecer un simulador individual de riesgo.</w:t>
+        <w:t xml:space="preserve"> priorizar población para chequeos, dimensionar el problema por segmentos y ofrecer un simulador individual de riesgo.</w:t>
       </w:r>
     </w:p>
     <w:p>
@@ -295,7 +295,7 @@
         <w:pStyle w:val="Heading1"/>
       </w:pPr>
       <w:r>
-        <w:t xml:space="preserve">3. Arquitectura tecnica</w:t>
+        <w:t xml:space="preserve">3. Arquitectura técnica</w:t>
       </w:r>
     </w:p>
     <w:p>
@@ -303,7 +303,7 @@
         <w:spacing w:after="120"/>
       </w:pPr>
       <w:r>
-        <w:t xml:space="preserve">El proyecto usa Kedro como framework de orquestacion: catalogo de datos declarativo (las rutas viven en catalog.yml, no en el codigo) y el flujo dividido en pipelines independientes y reproducibles.</w:t>
+        <w:t xml:space="preserve">El proyecto usa Kedro como framework de orquestación: catálogo de datos declarativo (las rutas viven en catalog.yml, no en el código) y el flujo dividido en pipelines independientes y reproducibles.</w:t>
       </w:r>
     </w:p>
     <w:tbl>
@@ -416,7 +416,7 @@
                 <w:sz w:val="19"/>
                 <w:szCs w:val="19"/>
               </w:rPr>
-              <w:t xml:space="preserve">Tecnologia</w:t>
+              <w:t xml:space="preserve">Tecnología</w:t>
             </w:r>
           </w:p>
         </w:tc>
@@ -480,7 +480,7 @@
                 <w:sz w:val="19"/>
                 <w:szCs w:val="19"/>
               </w:rPr>
-              <w:t xml:space="preserve">8 archivos XPT + umbrales + auditoria</w:t>
+              <w:t xml:space="preserve">8 archivos XPT + umbrales + auditoría</w:t>
             </w:r>
           </w:p>
         </w:tc>
@@ -575,7 +575,7 @@
                 <w:sz w:val="19"/>
                 <w:szCs w:val="19"/>
               </w:rPr>
-              <w:t xml:space="preserve">merge SEQN, imputacion, target, encoding</w:t>
+              <w:t xml:space="preserve">merge SEQN, imputación, target, encoding</w:t>
             </w:r>
           </w:p>
         </w:tc>
@@ -670,7 +670,7 @@
                 <w:sz w:val="19"/>
                 <w:szCs w:val="19"/>
               </w:rPr>
-              <w:t xml:space="preserve">6 clasificadores + calibracion</w:t>
+              <w:t xml:space="preserve">6 clasificadores + calibración</w:t>
             </w:r>
           </w:p>
         </w:tc>
@@ -926,7 +926,7 @@
         <w:spacing w:after="120"/>
       </w:pPr>
       <w:r>
-        <w:t xml:space="preserve">Integra tres tipos de fuentes, cumpliendo el requisito de multi-fuente:</w:t>
+        <w:t xml:space="preserve">Integra tres tipos de fuentes, cumpliendo el requisito de integración de múltiples fuentes:</w:t>
       </w:r>
     </w:p>
     <w:p>
@@ -988,7 +988,7 @@
           <w:b w:val="false"/>
           <w:bCs w:val="false"/>
         </w:rPr>
-        <w:t xml:space="preserve"> criterios clinicos parametrizados (A1C, glucosa, IMC, edad).</w:t>
+        <w:t xml:space="preserve"> criterios clínicos parametrizados (A1C, glucosa, IMC, edad).</w:t>
       </w:r>
     </w:p>
     <w:p>
@@ -1012,14 +1012,14 @@
           <w:b/>
           <w:bCs/>
         </w:rPr>
-        <w:t xml:space="preserve">Base SQLite de auditoria:</w:t>
+        <w:t xml:space="preserve">Base SQLite de auditoría:</w:t>
       </w:r>
       <w:r>
         <w:rPr>
           <w:b w:val="false"/>
           <w:bCs w:val="false"/>
         </w:rPr>
-        <w:t xml:space="preserve"> tablas ingestion_audit y etl_audit que registran filas, columnas y nulos antes/despues por corrida.</w:t>
+        <w:t xml:space="preserve"> tablas ingestion_audit y etl_audit que registran filas, columnas y nulos antes/después por corrida.</w:t>
       </w:r>
     </w:p>
     <w:p>
@@ -1027,7 +1027,7 @@
         <w:spacing w:after="120"/>
       </w:pPr>
       <w:r>
-        <w:t xml:space="preserve">Robustez: la union se hace por la llave SEQN con validacion que aborta si hay SEQN duplicado; validate_required_columns lanza error si falta una columna obligatoria; los codigos especiales NHANES (7, 9, 77, 99) se convierten a nulo antes de imputar.</w:t>
+        <w:t xml:space="preserve">Robustez: la unión se hace por la llave SEQN con validación que aborta si hay SEQN duplicado; validate_required_columns lanza error si falta una columna obligatoria; los códigos especiales NHANES (7, 9, 77, 99) se convierten a nulo antes de imputar.</w:t>
       </w:r>
     </w:p>
     <w:p>
@@ -1035,7 +1035,7 @@
         <w:pStyle w:val="Heading1"/>
       </w:pPr>
       <w:r>
-        <w:t xml:space="preserve">5. Transformaciones avanzadas y optimizacion</w:t>
+        <w:t xml:space="preserve">5. Transformaciones avanzadas y optimización</w:t>
       </w:r>
     </w:p>
     <w:p>
@@ -1043,7 +1043,7 @@
         <w:spacing w:after="120"/>
       </w:pPr>
       <w:r>
-        <w:t xml:space="preserve">Se aplican tecnicas optimizadas para gran escala (modulo utils/transforms.py), con impacto medido sobre el dataset real:</w:t>
+        <w:t xml:space="preserve">Se aplican técnicas optimizadas para gran escala (módulo utils/transforms.py), con impacto medido sobre el dataset real:</w:t>
       </w:r>
     </w:p>
     <w:tbl>
@@ -1092,7 +1092,7 @@
                 <w:sz w:val="19"/>
                 <w:szCs w:val="19"/>
               </w:rPr>
-              <w:t xml:space="preserve">Tecnica</w:t>
+              <w:t xml:space="preserve">Técnica</w:t>
             </w:r>
           </w:p>
         </w:tc>
@@ -1124,7 +1124,7 @@
                 <w:sz w:val="19"/>
                 <w:szCs w:val="19"/>
               </w:rPr>
-              <w:t xml:space="preserve">Metodo</w:t>
+              <w:t xml:space="preserve">Método</w:t>
             </w:r>
           </w:p>
         </w:tc>
@@ -1189,7 +1189,7 @@
                 <w:sz w:val="19"/>
                 <w:szCs w:val="19"/>
               </w:rPr>
-              <w:t xml:space="preserve">Optimizacion memoria</w:t>
+              <w:t xml:space="preserve">Optimización memoria</w:t>
             </w:r>
           </w:p>
         </w:tc>
@@ -1346,7 +1346,7 @@
                 <w:sz w:val="19"/>
                 <w:szCs w:val="19"/>
               </w:rPr>
-              <w:t xml:space="preserve">estandarizacion sin bucles</w:t>
+              <w:t xml:space="preserve">estandarización sin bucles</w:t>
             </w:r>
           </w:p>
         </w:tc>
@@ -1642,7 +1642,7 @@
         <w:pStyle w:val="Heading1"/>
       </w:pPr>
       <w:r>
-        <w:t xml:space="preserve">6. Limpieza y construccion del target</w:t>
+        <w:t xml:space="preserve">6. Limpieza y construcción del target</w:t>
       </w:r>
     </w:p>
     <w:p>
@@ -1650,7 +1650,7 @@
         <w:spacing w:after="120"/>
       </w:pPr>
       <w:r>
-        <w:t xml:space="preserve">La variable diabetes_target se construye ANTES de imputar sus fuentes para no inventar positivos: vale 1 si DIQ010 = 1 (diagnostico reportado), o LBXGH &gt;= 6,5 (A1C), o LBXGLU &gt;= 126 (glucosa en ayunas); 0 en caso contrario. Las filas sin ninguna fuente determinable se descartan en lugar de asumir un 0.</w:t>
+        <w:t xml:space="preserve">La variable diabetes_target se construye ANTES de imputar sus fuentes para no inventar positivos: vale 1 si DIQ010 = 1 (diagnóstico reportado), o LBXGH &gt;= 6,5 (A1C), o LBXGLU &gt;= 126 (glucosa en ayunas); 0 en caso contrario. Las filas sin ninguna fuente determinable se descartan en lugar de asumir un 0.</w:t>
       </w:r>
     </w:p>
     <w:p>
@@ -1658,7 +1658,7 @@
         <w:spacing w:after="120"/>
       </w:pPr>
       <w:r>
-        <w:t xml:space="preserve">Decision clave (revision de calidad): se detecto y corrigio una fuga de datos excluyendo los biomarcadores que definen el target (LBXGH, LBXGLU y derivados) del conjunto de features, evitando metricas infladas artificialmente.</w:t>
+        <w:t xml:space="preserve">Decisión clave (revisión de calidad): se detectó y corrigió una fuga de datos excluyendo los biomarcadores que definen el target (LBXGH, LBXGLU y derivados) del conjunto de features, evitando métricas infladas artificialmente.</w:t>
       </w:r>
     </w:p>
     <w:p>
@@ -1674,7 +1674,7 @@
         <w:spacing w:after="120"/>
       </w:pPr>
       <w:r>
-        <w:t xml:space="preserve">Se entrenaron y compararon seis clasificadores dentro de un Pipeline ajustado solo con train (sin fuga), con class_weight balanceado y seleccion por PR-AUC, metrica honesta ante clases desbalanceadas (prevalencia 16 %).</w:t>
+        <w:t xml:space="preserve">Se entrenaron y compararon seis clasificadores dentro de un Pipeline ajustado solo con train (sin fuga), con class_weight balanceado y selección por PR-AUC, métrica honesta ante clases desbalanceadas (prevalencia 16 %).</w:t>
       </w:r>
     </w:p>
     <w:tbl>
@@ -3033,7 +3033,7 @@
           <w:sz w:val="18"/>
           <w:szCs w:val="18"/>
         </w:rPr>
-        <w:t xml:space="preserve">* Modelo seleccionado (mayor PR-AUC). Calibrado con isotonic regression, umbral optimo 0,31, Brier 0,11.</w:t>
+        <w:t xml:space="preserve">* Modelo seleccionado (mayor PR-AUC). Calibrado con isotonic regression, umbral óptimo 0,31, Brier 0,11.</w:t>
       </w:r>
     </w:p>
     <w:p>
@@ -3041,7 +3041,7 @@
         <w:spacing w:after="120"/>
       </w:pPr>
       <w:r>
-        <w:t xml:space="preserve">Interpretacion: la regresion logistica gana en PR-AUC y recall, detectando ~75 % de los casos positivos; el resto de modelos ofrece mayor accuracy pero menor recall, poco util cuando el costo de no detectar un caso es alto.</w:t>
+        <w:t xml:space="preserve">Interpretación: la regresión logística gana en PR-AUC y recall, detectando ~75 % de los casos positivos; el resto de modelos ofrece mayor accuracy pero menor recall, poco útil cuando el costo de no detectar un caso es alto.</w:t>
       </w:r>
     </w:p>
     <w:p>
@@ -3103,7 +3103,7 @@
           <w:sz w:val="18"/>
           <w:szCs w:val="18"/>
         </w:rPr>
-        <w:t xml:space="preserve">Figura 1. Matriz de confusion (umbral 0,31): TN=1109, FP=260, FN=99, TP=162.</w:t>
+        <w:t xml:space="preserve">Figura 1. Matriz de confusión (umbral 0,31): TN=1109, FP=260, FN=99, TP=162.</w:t>
       </w:r>
     </w:p>
     <w:p>
@@ -3181,7 +3181,7 @@
         <w:spacing w:after="120"/>
       </w:pPr>
       <w:r>
-        <w:t xml:space="preserve">La API FastAPI expone salud, metadatos, metricas y prediccion (individual y por lote), documentada automaticamente en /docs. Si el modelo no existe responde 503 en lugar de caerse.</w:t>
+        <w:t xml:space="preserve">La API FastAPI expone salud, metadatos, métricas y predicción (individual y por lote), documentada automáticamente en /docs. Si el modelo no existe responde 503 en lugar de caerse.</w:t>
       </w:r>
     </w:p>
     <w:tbl>
@@ -3262,7 +3262,7 @@
                 <w:sz w:val="19"/>
                 <w:szCs w:val="19"/>
               </w:rPr>
-              <w:t xml:space="preserve">Metodo</w:t>
+              <w:t xml:space="preserve">Método</w:t>
             </w:r>
           </w:p>
         </w:tc>
@@ -3294,7 +3294,7 @@
                 <w:sz w:val="19"/>
                 <w:szCs w:val="19"/>
               </w:rPr>
-              <w:t xml:space="preserve">Descripcion</w:t>
+              <w:t xml:space="preserve">Descripción</w:t>
             </w:r>
           </w:p>
         </w:tc>
@@ -3484,7 +3484,7 @@
                 <w:sz w:val="19"/>
                 <w:szCs w:val="19"/>
               </w:rPr>
-              <w:t xml:space="preserve">nombre y version del modelo</w:t>
+              <w:t xml:space="preserve">nombre y versión del modelo</w:t>
             </w:r>
           </w:p>
         </w:tc>
@@ -3579,7 +3579,7 @@
                 <w:sz w:val="19"/>
                 <w:szCs w:val="19"/>
               </w:rPr>
-              <w:t xml:space="preserve">metricas del modelo entrenado</w:t>
+              <w:t xml:space="preserve">métricas del modelo entrenado</w:t>
             </w:r>
           </w:p>
         </w:tc>
@@ -3674,7 +3674,7 @@
                 <w:sz w:val="19"/>
                 <w:szCs w:val="19"/>
               </w:rPr>
-              <w:t xml:space="preserve">prediccion de riesgo individual</w:t>
+              <w:t xml:space="preserve">predicción de riesgo individual</w:t>
             </w:r>
           </w:p>
         </w:tc>
@@ -3769,7 +3769,7 @@
                 <w:sz w:val="19"/>
                 <w:szCs w:val="19"/>
               </w:rPr>
-              <w:t xml:space="preserve">prediccion por lote</w:t>
+              <w:t xml:space="preserve">predicción por lote</w:t>
             </w:r>
           </w:p>
         </w:tc>
@@ -3788,7 +3788,7 @@
         <w:spacing w:after="120"/>
       </w:pPr>
       <w:r>
-        <w:t xml:space="preserve">El dashboard (Next.js) ofrece tres vistas por audiencia: Ejecutiva (KPIs y distribuciones), Tecnica (metricas, matriz de confusion, importancia) y Operativa (filtros, descarga CSV y simulador de prediccion).</w:t>
+        <w:t xml:space="preserve">El dashboard (Next.js) ofrece tres vistas por audiencia: Ejecutiva (KPIs y distribuciones), Técnica (métricas, matriz de confusión, importancia) y Operativa (filtros, descarga CSV y simulador de predicción).</w:t>
       </w:r>
     </w:p>
     <w:p>
@@ -3796,7 +3796,7 @@
         <w:pStyle w:val="Heading1"/>
       </w:pPr>
       <w:r>
-        <w:t xml:space="preserve">9. Containerizacion, CI/CD y despliegue</w:t>
+        <w:t xml:space="preserve">9. Contenerización, CI/CD y despliegue</w:t>
       </w:r>
     </w:p>
     <w:p>
@@ -3827,7 +3827,7 @@
           <w:b w:val="false"/>
           <w:bCs w:val="false"/>
         </w:rPr>
-        <w:t xml:space="preserve"> cuatro servicios (kedro-etl, api, dashboard, db) orquestados con docker-compose; depends_on para el orden, volumen data/ compartido e imagenes python:3.11-slim optimizadas por capas.</w:t>
+        <w:t xml:space="preserve"> cuatro servicios (kedro-etl, api, dashboard, db) orquestados con docker-compose; depends_on para el orden, volumen data/ compartido e imágenes python:3.11-slim optimizadas por capas.</w:t>
       </w:r>
     </w:p>
     <w:p>
@@ -3897,7 +3897,7 @@
         <w:pStyle w:val="Heading1"/>
       </w:pPr>
       <w:r>
-        <w:t xml:space="preserve">10. KPIs y analisis de resultados</w:t>
+        <w:t xml:space="preserve">10. KPIs y análisis de resultados</w:t>
       </w:r>
     </w:p>
     <w:tbl>
@@ -4266,7 +4266,7 @@
                 <w:sz w:val="19"/>
                 <w:szCs w:val="19"/>
               </w:rPr>
-              <w:t xml:space="preserve">Reduccion de memoria (ETL)</w:t>
+              <w:t xml:space="preserve">Reducción de memoria (ETL)</w:t>
             </w:r>
           </w:p>
         </w:tc>
@@ -4372,7 +4372,7 @@
         <w:pStyle w:val="Heading1"/>
       </w:pPr>
       <w:r>
-        <w:t xml:space="preserve">11. Colaboracion y gestion de proyecto</w:t>
+        <w:t xml:space="preserve">11. Colaboración y gestión de proyecto</w:t>
       </w:r>
     </w:p>
     <w:p>
@@ -4380,15 +4380,432 @@
         <w:spacing w:after="120"/>
       </w:pPr>
       <w:r>
-        <w:t xml:space="preserve">Estrategia Git Flow simplificada: main estable, develop de integracion y una rama feature por responsabilidad. Ninguna rama feature se integro directo a main; todo paso por Pull Request a develop con revision. Se registraron 8 Pull Requests y un revert (PR #4) que evidencia que el control de calidad detecto y corrigio un merge incorrecto.</w:t>
-      </w:r>
-    </w:p>
+        <w:t xml:space="preserve">El equipo se organizó en tres ramas de responsabilidad (feature/a, feature/b, feature/c), cada una con un integrante a cargo:</w:t>
+      </w:r>
+    </w:p>
+    <w:tbl>
+      <w:tblPr>
+        <w:tblW w:type="dxa" w:w="9360"/>
+        <w:tblBorders>
+          <w:top w:val="single" w:color="auto" w:sz="4"/>
+          <w:left w:val="single" w:color="auto" w:sz="4"/>
+          <w:bottom w:val="single" w:color="auto" w:sz="4"/>
+          <w:right w:val="single" w:color="auto" w:sz="4"/>
+          <w:insideH w:val="single" w:color="auto" w:sz="4"/>
+          <w:insideV w:val="single" w:color="auto" w:sz="4"/>
+        </w:tblBorders>
+      </w:tblPr>
+      <w:tblGrid>
+        <w:gridCol w:w="2200"/>
+        <w:gridCol w:w="1500"/>
+        <w:gridCol w:w="5660"/>
+      </w:tblGrid>
+      <w:tr>
+        <w:tc>
+          <w:tcPr>
+            <w:tcW w:type="dxa" w:w="2200"/>
+            <w:tcBorders>
+              <w:top w:val="single" w:color="CCCCCC" w:sz="1"/>
+              <w:left w:val="single" w:color="CCCCCC" w:sz="1"/>
+              <w:bottom w:val="single" w:color="CCCCCC" w:sz="1"/>
+              <w:right w:val="single" w:color="CCCCCC" w:sz="1"/>
+            </w:tcBorders>
+            <w:shd w:fill="D5E8F0" w:val="clear"/>
+            <w:tcMar>
+              <w:top w:type="dxa" w:w="60"/>
+              <w:left w:type="dxa" w:w="110"/>
+              <w:bottom w:type="dxa" w:w="60"/>
+              <w:right w:type="dxa" w:w="110"/>
+            </w:tcMar>
+          </w:tcPr>
+          <w:p>
+            <w:pPr>
+              <w:jc w:val="left"/>
+            </w:pPr>
+            <w:r>
+              <w:rPr>
+                <w:b/>
+                <w:bCs/>
+                <w:sz w:val="19"/>
+                <w:szCs w:val="19"/>
+              </w:rPr>
+              <w:t xml:space="preserve">Integrante</w:t>
+            </w:r>
+          </w:p>
+        </w:tc>
+        <w:tc>
+          <w:tcPr>
+            <w:tcW w:type="dxa" w:w="1500"/>
+            <w:tcBorders>
+              <w:top w:val="single" w:color="CCCCCC" w:sz="1"/>
+              <w:left w:val="single" w:color="CCCCCC" w:sz="1"/>
+              <w:bottom w:val="single" w:color="CCCCCC" w:sz="1"/>
+              <w:right w:val="single" w:color="CCCCCC" w:sz="1"/>
+            </w:tcBorders>
+            <w:shd w:fill="D5E8F0" w:val="clear"/>
+            <w:tcMar>
+              <w:top w:type="dxa" w:w="60"/>
+              <w:left w:type="dxa" w:w="110"/>
+              <w:bottom w:type="dxa" w:w="60"/>
+              <w:right w:type="dxa" w:w="110"/>
+            </w:tcMar>
+          </w:tcPr>
+          <w:p>
+            <w:pPr>
+              <w:jc w:val="center"/>
+            </w:pPr>
+            <w:r>
+              <w:rPr>
+                <w:b/>
+                <w:bCs/>
+                <w:sz w:val="19"/>
+                <w:szCs w:val="19"/>
+              </w:rPr>
+              <w:t xml:space="preserve">Rama</w:t>
+            </w:r>
+          </w:p>
+        </w:tc>
+        <w:tc>
+          <w:tcPr>
+            <w:tcW w:type="dxa" w:w="5660"/>
+            <w:tcBorders>
+              <w:top w:val="single" w:color="CCCCCC" w:sz="1"/>
+              <w:left w:val="single" w:color="CCCCCC" w:sz="1"/>
+              <w:bottom w:val="single" w:color="CCCCCC" w:sz="1"/>
+              <w:right w:val="single" w:color="CCCCCC" w:sz="1"/>
+            </w:tcBorders>
+            <w:shd w:fill="D5E8F0" w:val="clear"/>
+            <w:tcMar>
+              <w:top w:type="dxa" w:w="60"/>
+              <w:left w:type="dxa" w:w="110"/>
+              <w:bottom w:type="dxa" w:w="60"/>
+              <w:right w:type="dxa" w:w="110"/>
+            </w:tcMar>
+          </w:tcPr>
+          <w:p>
+            <w:pPr>
+              <w:jc w:val="center"/>
+            </w:pPr>
+            <w:r>
+              <w:rPr>
+                <w:b/>
+                <w:bCs/>
+                <w:sz w:val="19"/>
+                <w:szCs w:val="19"/>
+              </w:rPr>
+              <w:t xml:space="preserve">Responsabilidad</w:t>
+            </w:r>
+          </w:p>
+        </w:tc>
+      </w:tr>
+      <w:tr>
+        <w:tc>
+          <w:tcPr>
+            <w:tcW w:type="dxa" w:w="2200"/>
+            <w:tcBorders>
+              <w:top w:val="single" w:color="CCCCCC" w:sz="1"/>
+              <w:left w:val="single" w:color="CCCCCC" w:sz="1"/>
+              <w:bottom w:val="single" w:color="CCCCCC" w:sz="1"/>
+              <w:right w:val="single" w:color="CCCCCC" w:sz="1"/>
+            </w:tcBorders>
+            <w:tcMar>
+              <w:top w:type="dxa" w:w="60"/>
+              <w:left w:type="dxa" w:w="110"/>
+              <w:bottom w:type="dxa" w:w="60"/>
+              <w:right w:type="dxa" w:w="110"/>
+            </w:tcMar>
+          </w:tcPr>
+          <w:p>
+            <w:pPr>
+              <w:jc w:val="left"/>
+            </w:pPr>
+            <w:r>
+              <w:rPr>
+                <w:b w:val="false"/>
+                <w:bCs w:val="false"/>
+                <w:sz w:val="19"/>
+                <w:szCs w:val="19"/>
+              </w:rPr>
+              <w:t xml:space="preserve">Manuel Díaz</w:t>
+            </w:r>
+          </w:p>
+        </w:tc>
+        <w:tc>
+          <w:tcPr>
+            <w:tcW w:type="dxa" w:w="1500"/>
+            <w:tcBorders>
+              <w:top w:val="single" w:color="CCCCCC" w:sz="1"/>
+              <w:left w:val="single" w:color="CCCCCC" w:sz="1"/>
+              <w:bottom w:val="single" w:color="CCCCCC" w:sz="1"/>
+              <w:right w:val="single" w:color="CCCCCC" w:sz="1"/>
+            </w:tcBorders>
+            <w:tcMar>
+              <w:top w:type="dxa" w:w="60"/>
+              <w:left w:type="dxa" w:w="110"/>
+              <w:bottom w:type="dxa" w:w="60"/>
+              <w:right w:type="dxa" w:w="110"/>
+            </w:tcMar>
+          </w:tcPr>
+          <w:p>
+            <w:pPr>
+              <w:jc w:val="center"/>
+            </w:pPr>
+            <w:r>
+              <w:rPr>
+                <w:b w:val="false"/>
+                <w:bCs w:val="false"/>
+                <w:sz w:val="19"/>
+                <w:szCs w:val="19"/>
+              </w:rPr>
+              <w:t xml:space="preserve">feature/a</w:t>
+            </w:r>
+          </w:p>
+        </w:tc>
+        <w:tc>
+          <w:tcPr>
+            <w:tcW w:type="dxa" w:w="5660"/>
+            <w:tcBorders>
+              <w:top w:val="single" w:color="CCCCCC" w:sz="1"/>
+              <w:left w:val="single" w:color="CCCCCC" w:sz="1"/>
+              <w:bottom w:val="single" w:color="CCCCCC" w:sz="1"/>
+              <w:right w:val="single" w:color="CCCCCC" w:sz="1"/>
+            </w:tcBorders>
+            <w:tcMar>
+              <w:top w:type="dxa" w:w="60"/>
+              <w:left w:type="dxa" w:w="110"/>
+              <w:bottom w:type="dxa" w:w="60"/>
+              <w:right w:type="dxa" w:w="110"/>
+            </w:tcMar>
+          </w:tcPr>
+          <w:p>
+            <w:pPr>
+              <w:jc w:val="center"/>
+            </w:pPr>
+            <w:r>
+              <w:rPr>
+                <w:b w:val="false"/>
+                <w:bCs w:val="false"/>
+                <w:sz w:val="19"/>
+                <w:szCs w:val="19"/>
+              </w:rPr>
+              <w:t xml:space="preserve">Arquitectura Kedro, catálogo de datos e ingesta de las fuentes NHANES.</w:t>
+            </w:r>
+          </w:p>
+        </w:tc>
+      </w:tr>
+      <w:tr>
+        <w:tc>
+          <w:tcPr>
+            <w:tcW w:type="dxa" w:w="2200"/>
+            <w:tcBorders>
+              <w:top w:val="single" w:color="CCCCCC" w:sz="1"/>
+              <w:left w:val="single" w:color="CCCCCC" w:sz="1"/>
+              <w:bottom w:val="single" w:color="CCCCCC" w:sz="1"/>
+              <w:right w:val="single" w:color="CCCCCC" w:sz="1"/>
+            </w:tcBorders>
+            <w:tcMar>
+              <w:top w:type="dxa" w:w="60"/>
+              <w:left w:type="dxa" w:w="110"/>
+              <w:bottom w:type="dxa" w:w="60"/>
+              <w:right w:type="dxa" w:w="110"/>
+            </w:tcMar>
+          </w:tcPr>
+          <w:p>
+            <w:pPr>
+              <w:jc w:val="left"/>
+            </w:pPr>
+            <w:r>
+              <w:rPr>
+                <w:b w:val="false"/>
+                <w:bCs w:val="false"/>
+                <w:sz w:val="19"/>
+                <w:szCs w:val="19"/>
+              </w:rPr>
+              <w:t xml:space="preserve">Guillermo Cerda</w:t>
+            </w:r>
+          </w:p>
+        </w:tc>
+        <w:tc>
+          <w:tcPr>
+            <w:tcW w:type="dxa" w:w="1500"/>
+            <w:tcBorders>
+              <w:top w:val="single" w:color="CCCCCC" w:sz="1"/>
+              <w:left w:val="single" w:color="CCCCCC" w:sz="1"/>
+              <w:bottom w:val="single" w:color="CCCCCC" w:sz="1"/>
+              <w:right w:val="single" w:color="CCCCCC" w:sz="1"/>
+            </w:tcBorders>
+            <w:tcMar>
+              <w:top w:type="dxa" w:w="60"/>
+              <w:left w:type="dxa" w:w="110"/>
+              <w:bottom w:type="dxa" w:w="60"/>
+              <w:right w:type="dxa" w:w="110"/>
+            </w:tcMar>
+          </w:tcPr>
+          <w:p>
+            <w:pPr>
+              <w:jc w:val="center"/>
+            </w:pPr>
+            <w:r>
+              <w:rPr>
+                <w:b w:val="false"/>
+                <w:bCs w:val="false"/>
+                <w:sz w:val="19"/>
+                <w:szCs w:val="19"/>
+              </w:rPr>
+              <w:t xml:space="preserve">feature/b</w:t>
+            </w:r>
+          </w:p>
+        </w:tc>
+        <w:tc>
+          <w:tcPr>
+            <w:tcW w:type="dxa" w:w="5660"/>
+            <w:tcBorders>
+              <w:top w:val="single" w:color="CCCCCC" w:sz="1"/>
+              <w:left w:val="single" w:color="CCCCCC" w:sz="1"/>
+              <w:bottom w:val="single" w:color="CCCCCC" w:sz="1"/>
+              <w:right w:val="single" w:color="CCCCCC" w:sz="1"/>
+            </w:tcBorders>
+            <w:tcMar>
+              <w:top w:type="dxa" w:w="60"/>
+              <w:left w:type="dxa" w:w="110"/>
+              <w:bottom w:type="dxa" w:w="60"/>
+              <w:right w:type="dxa" w:w="110"/>
+            </w:tcMar>
+          </w:tcPr>
+          <w:p>
+            <w:pPr>
+              <w:jc w:val="center"/>
+            </w:pPr>
+            <w:r>
+              <w:rPr>
+                <w:b w:val="false"/>
+                <w:bCs w:val="false"/>
+                <w:sz w:val="19"/>
+                <w:szCs w:val="19"/>
+              </w:rPr>
+              <w:t xml:space="preserve">Limpieza, unión por SEQN, construcción del target y features derivadas.</w:t>
+            </w:r>
+          </w:p>
+        </w:tc>
+      </w:tr>
+      <w:tr>
+        <w:tc>
+          <w:tcPr>
+            <w:tcW w:type="dxa" w:w="2200"/>
+            <w:tcBorders>
+              <w:top w:val="single" w:color="CCCCCC" w:sz="1"/>
+              <w:left w:val="single" w:color="CCCCCC" w:sz="1"/>
+              <w:bottom w:val="single" w:color="CCCCCC" w:sz="1"/>
+              <w:right w:val="single" w:color="CCCCCC" w:sz="1"/>
+            </w:tcBorders>
+            <w:tcMar>
+              <w:top w:type="dxa" w:w="60"/>
+              <w:left w:type="dxa" w:w="110"/>
+              <w:bottom w:type="dxa" w:w="60"/>
+              <w:right w:type="dxa" w:w="110"/>
+            </w:tcMar>
+          </w:tcPr>
+          <w:p>
+            <w:pPr>
+              <w:jc w:val="left"/>
+            </w:pPr>
+            <w:r>
+              <w:rPr>
+                <w:b w:val="false"/>
+                <w:bCs w:val="false"/>
+                <w:sz w:val="19"/>
+                <w:szCs w:val="19"/>
+              </w:rPr>
+              <w:t xml:space="preserve">Claudio Aro</w:t>
+            </w:r>
+          </w:p>
+        </w:tc>
+        <w:tc>
+          <w:tcPr>
+            <w:tcW w:type="dxa" w:w="1500"/>
+            <w:tcBorders>
+              <w:top w:val="single" w:color="CCCCCC" w:sz="1"/>
+              <w:left w:val="single" w:color="CCCCCC" w:sz="1"/>
+              <w:bottom w:val="single" w:color="CCCCCC" w:sz="1"/>
+              <w:right w:val="single" w:color="CCCCCC" w:sz="1"/>
+            </w:tcBorders>
+            <w:tcMar>
+              <w:top w:type="dxa" w:w="60"/>
+              <w:left w:type="dxa" w:w="110"/>
+              <w:bottom w:type="dxa" w:w="60"/>
+              <w:right w:type="dxa" w:w="110"/>
+            </w:tcMar>
+          </w:tcPr>
+          <w:p>
+            <w:pPr>
+              <w:jc w:val="center"/>
+            </w:pPr>
+            <w:r>
+              <w:rPr>
+                <w:b w:val="false"/>
+                <w:bCs w:val="false"/>
+                <w:sz w:val="19"/>
+                <w:szCs w:val="19"/>
+              </w:rPr>
+              <w:t xml:space="preserve">feature/c</w:t>
+            </w:r>
+          </w:p>
+        </w:tc>
+        <w:tc>
+          <w:tcPr>
+            <w:tcW w:type="dxa" w:w="5660"/>
+            <w:tcBorders>
+              <w:top w:val="single" w:color="CCCCCC" w:sz="1"/>
+              <w:left w:val="single" w:color="CCCCCC" w:sz="1"/>
+              <w:bottom w:val="single" w:color="CCCCCC" w:sz="1"/>
+              <w:right w:val="single" w:color="CCCCCC" w:sz="1"/>
+            </w:tcBorders>
+            <w:tcMar>
+              <w:top w:type="dxa" w:w="60"/>
+              <w:left w:type="dxa" w:w="110"/>
+              <w:bottom w:type="dxa" w:w="60"/>
+              <w:right w:type="dxa" w:w="110"/>
+            </w:tcMar>
+          </w:tcPr>
+          <w:p>
+            <w:pPr>
+              <w:jc w:val="center"/>
+            </w:pPr>
+            <w:r>
+              <w:rPr>
+                <w:b w:val="false"/>
+                <w:bCs w:val="false"/>
+                <w:sz w:val="19"/>
+                <w:szCs w:val="19"/>
+              </w:rPr>
+              <w:t xml:space="preserve">Modelado final, calibración, API REST, dashboard, Docker y despliegue en AWS.</w:t>
+            </w:r>
+          </w:p>
+        </w:tc>
+      </w:tr>
+    </w:tbl>
     <w:p>
       <w:pPr>
         <w:spacing w:after="120"/>
       </w:pPr>
       <w:r>
-        <w:t xml:space="preserve">La colaboracion se apoyo en un contrato de interfaz (docs/CONTRATO_FEATURE_B.md) que fijo las columnas del dataset entre ramas, permitiendo desarrollar modelado, API y dashboard en paralelo.</w:t>
+        <w:t xml:space="preserve"/>
+      </w:r>
+    </w:p>
+    <w:p>
+      <w:pPr>
+        <w:spacing w:after="120"/>
+      </w:pPr>
+      <w:r>
+        <w:t xml:space="preserve">Estrategia Git Flow simplificada: main estable, develop de integración y una rama feature por responsabilidad. Ninguna rama feature se integró directo a main; todo pasó por Pull Request a develop con revisión. Se registraron 8 Pull Requests y un revert (PR #4) que evidencia que el control de calidad detectó y corrigió un merge incorrecto.</w:t>
+      </w:r>
+    </w:p>
+    <w:p>
+      <w:pPr>
+        <w:spacing w:after="120"/>
+      </w:pPr>
+      <w:r>
+        <w:t xml:space="preserve">La colaboración se apoyó en un contrato de interfaz (docs/CONTRATO_FEATURE_B.md) que fijó las columnas del dataset entre ramas, permitiendo desarrollar modelado, API y dashboard en paralelo.</w:t>
       </w:r>
     </w:p>
     <w:p>
@@ -4413,7 +4830,7 @@
           <w:b w:val="false"/>
           <w:bCs w:val="false"/>
         </w:rPr>
-        <w:t xml:space="preserve">El target es una etiqueta educativa (criterios ADA), no un diagnostico clinico; algunas variables son autoinformadas.</w:t>
+        <w:t xml:space="preserve">El target es una etiqueta educativa (criterios ADA), no un diagnóstico clínico; algunas variables son autoinformadas.</w:t>
       </w:r>
     </w:p>
     <w:p>
@@ -4430,7 +4847,7 @@
           <w:b w:val="false"/>
           <w:bCs w:val="false"/>
         </w:rPr>
-        <w:t xml:space="preserve">NHANES es una encuesta poblacional transversal, no una historia clinica longitudinal.</w:t>
+        <w:t xml:space="preserve">NHANES es una encuesta poblacional transversal, no una historia clínica longitudinal.</w:t>
       </w:r>
     </w:p>
     <w:p>
@@ -4579,7 +4996,7 @@
         <w:sz w:val="16"/>
         <w:szCs w:val="16"/>
       </w:rPr>
-      <w:t xml:space="preserve">Pagina </w:t>
+      <w:t xml:space="preserve">Página </w:t>
     </w:r>
     <w:r>
       <w:rPr>
@@ -4645,7 +5062,7 @@
         <w:sz w:val="16"/>
         <w:szCs w:val="16"/>
       </w:rPr>
-      <w:t xml:space="preserve">DiabetesNHANES - Informe Tecnico Ejecutivo</w:t>
+      <w:t xml:space="preserve">DiabetesNHANES - Informe Técnico Ejecutivo</w:t>
     </w:r>
   </w:p>
 </w:hdr>

</xml_diff>